<commit_message>
Introduce ports and adapters for core capabilities
</commit_message>
<xml_diff>
--- a/docs/ADAPTER_LAYER.docx
+++ b/docs/ADAPTER_LAYER.docx
@@ -14,7 +14,7 @@
     </w:p>
     <w:p>
       <w:r>
-        <w:t>Provide a stable API contract that decouples domain models from external responses.</w:t>
+        <w:t>Provide a stable capability contract so upstream code is isolated from downstream engine changes.</w:t>
       </w:r>
     </w:p>
     <w:p>
@@ -24,27 +24,37 @@
     </w:p>
     <w:p>
       <w:r>
-        <w:t>- Map domain objects to explicit response DTOs (NoteResponse, NoteDetailResponse, CommentResponse).</w:t>
+        <w:t>- Define Port interfaces per capability (content/interaction/search/identity/admin/brain).</w:t>
       </w:r>
     </w:p>
     <w:p>
       <w:r>
-        <w:t>- Keep response fields stable even if domain structures change.</w:t>
+        <w:t>- Provide default Adapters that translate port calls to current services.</w:t>
       </w:r>
     </w:p>
     <w:p>
       <w:r>
-        <w:t>Rules</w:t>
+        <w:t>Structure</w:t>
       </w:r>
     </w:p>
     <w:p>
       <w:r>
-        <w:t>- Controllers must return response DTOs, not domain entities.</w:t>
+        <w:t>- Ports: com.taronote.&lt;module&gt;.port</w:t>
       </w:r>
     </w:p>
     <w:p>
       <w:r>
-        <w:t>- Response DTOs live under com.taronote.*.web and expose only needed fields.</w:t>
+        <w:t>- Adapters: com.taronote.&lt;module&gt;.adapter</w:t>
+      </w:r>
+    </w:p>
+    <w:p>
+      <w:r>
+        <w:t>Config</w:t>
+      </w:r>
+    </w:p>
+    <w:p>
+      <w:r>
+        <w:t>- Default adapters are enabled via taronote.adapter.mode=default.</w:t>
       </w:r>
     </w:p>
     <w:p>
@@ -54,12 +64,12 @@
     </w:p>
     <w:p>
       <w:r>
-        <w:t>- Backend refactors do not break frontend contracts.</w:t>
+        <w:t>- Backend refactors do not break upstream contracts.</w:t>
       </w:r>
     </w:p>
     <w:p>
       <w:r>
-        <w:t>- Future API versioning is simpler.</w:t>
+        <w:t>- Future engine swaps only require a new Adapter implementation.</w:t>
       </w:r>
     </w:p>
     <w:p>
@@ -69,12 +79,12 @@
     </w:p>
     <w:p>
       <w:r>
-        <w:t>- Feed and Search already use NoteResponse.</w:t>
+        <w:t>- Content/Interaction/Search/Identity/Admin/Brain ports and adapters are in place.</w:t>
       </w:r>
     </w:p>
     <w:p>
       <w:r>
-        <w:t>- Note detail now uses NoteDetailResponse + CommentResponse.</w:t>
+        <w:t>- Note detail uses response DTOs to keep API stable.</w:t>
       </w:r>
     </w:p>
     <w:sectPr>

</xml_diff>

<commit_message>
Add logging capability port and adapter
</commit_message>
<xml_diff>
--- a/docs/ADAPTER_LAYER.docx
+++ b/docs/ADAPTER_LAYER.docx
@@ -24,7 +24,7 @@
     </w:p>
     <w:p>
       <w:r>
-        <w:t>- Define Port interfaces per capability (content/interaction/search/identity/admin/brain).</w:t>
+        <w:t>- Define Port interfaces per capability (content/interaction/search/identity/admin/brain/logging).</w:t>
       </w:r>
     </w:p>
     <w:p>
@@ -59,6 +59,11 @@
     </w:p>
     <w:p>
       <w:r>
+        <w:t>- Logging adapter is enabled via taronote.logging.mode=slf4j.</w:t>
+      </w:r>
+    </w:p>
+    <w:p>
+      <w:r>
         <w:t>Benefits</w:t>
       </w:r>
     </w:p>
@@ -84,6 +89,11 @@
     </w:p>
     <w:p>
       <w:r>
+        <w:t>- LoggingPort provides structured event logging.</w:t>
+      </w:r>
+    </w:p>
+    <w:p>
+      <w:r>
         <w:t>- Note detail uses response DTOs to keep API stable.</w:t>
       </w:r>
     </w:p>

</xml_diff>

<commit_message>
Integrate OpenTelemetry logging export
</commit_message>
<xml_diff>
--- a/docs/ADAPTER_LAYER.docx
+++ b/docs/ADAPTER_LAYER.docx
@@ -59,7 +59,12 @@
     </w:p>
     <w:p>
       <w:r>
-        <w:t>- Logging adapter is enabled via taronote.logging.mode=slf4j.</w:t>
+        <w:t>- LoggingPort default uses SLF4J; OTEL export via taronote.logging.mode=otel.</w:t>
+      </w:r>
+    </w:p>
+    <w:p>
+      <w:r>
+        <w:t>- OTEL endpoint via OTEL_EXPORTER_OTLP_ENDPOINT.</w:t>
       </w:r>
     </w:p>
     <w:p>

</xml_diff>

<commit_message>
Stabilize feed pagination with composite cursor
</commit_message>
<xml_diff>
--- a/docs/ADAPTER_LAYER.docx
+++ b/docs/ADAPTER_LAYER.docx
@@ -69,6 +69,16 @@
     </w:p>
     <w:p>
       <w:r>
+        <w:t>Feed Cursor</w:t>
+      </w:r>
+    </w:p>
+    <w:p>
+      <w:r>
+        <w:t>- Feed pagination uses composite cursor: createdAt + score + id.</w:t>
+      </w:r>
+    </w:p>
+    <w:p>
+      <w:r>
         <w:t>Benefits</w:t>
       </w:r>
     </w:p>

</xml_diff>

<commit_message>
Add cover image support for feed cards
</commit_message>
<xml_diff>
--- a/docs/ADAPTER_LAYER.docx
+++ b/docs/ADAPTER_LAYER.docx
@@ -79,6 +79,16 @@
     </w:p>
     <w:p>
       <w:r>
+        <w:t>Feed Cover</w:t>
+      </w:r>
+    </w:p>
+    <w:p>
+      <w:r>
+        <w:t>- Notes expose coverImage; default to first image if present.</w:t>
+      </w:r>
+    </w:p>
+    <w:p>
+      <w:r>
         <w:t>Benefits</w:t>
       </w:r>
     </w:p>

</xml_diff>

<commit_message>
Add tag support for notes and UI
</commit_message>
<xml_diff>
--- a/docs/ADAPTER_LAYER.docx
+++ b/docs/ADAPTER_LAYER.docx
@@ -89,6 +89,16 @@
     </w:p>
     <w:p>
       <w:r>
+        <w:t>Note Tags</w:t>
+      </w:r>
+    </w:p>
+    <w:p>
+      <w:r>
+        <w:t>- Notes expose tags for #topic display.</w:t>
+      </w:r>
+    </w:p>
+    <w:p>
+      <w:r>
         <w:t>Benefits</w:t>
       </w:r>
     </w:p>

</xml_diff>

<commit_message>
Expose interaction counts in feed and detail
</commit_message>
<xml_diff>
--- a/docs/ADAPTER_LAYER.docx
+++ b/docs/ADAPTER_LAYER.docx
@@ -99,6 +99,16 @@
     </w:p>
     <w:p>
       <w:r>
+        <w:t>Interaction Counts</w:t>
+      </w:r>
+    </w:p>
+    <w:p>
+      <w:r>
+        <w:t>- Feed/detail responses include like/comment/collect counts.</w:t>
+      </w:r>
+    </w:p>
+    <w:p>
+      <w:r>
         <w:t>Benefits</w:t>
       </w:r>
     </w:p>

</xml_diff>

<commit_message>
Add author info to feed and detail
</commit_message>
<xml_diff>
--- a/docs/ADAPTER_LAYER.docx
+++ b/docs/ADAPTER_LAYER.docx
@@ -109,6 +109,16 @@
     </w:p>
     <w:p>
       <w:r>
+        <w:t>Author Info</w:t>
+      </w:r>
+    </w:p>
+    <w:p>
+      <w:r>
+        <w:t>- Feed/detail responses include authorName/authorAvatar.</w:t>
+      </w:r>
+    </w:p>
+    <w:p>
+      <w:r>
         <w:t>Benefits</w:t>
       </w:r>
     </w:p>

</xml_diff>